<commit_message>
[0.0.7] - 2025-10-17 Completing PTZ Bench Testing Notes
</commit_message>
<xml_diff>
--- a/PTZ/Preset_List.docx
+++ b/PTZ/Preset_List.docx
@@ -3,11 +3,630 @@
 <w:document xmlns:wpc="http://schemas.microsoft.com/office/word/2010/wordprocessingCanvas" xmlns:cx="http://schemas.microsoft.com/office/drawing/2014/chartex" xmlns:cx1="http://schemas.microsoft.com/office/drawing/2015/9/8/chartex" xmlns:cx2="http://schemas.microsoft.com/office/drawing/2015/10/21/chartex" xmlns:cx3="http://schemas.microsoft.com/office/drawing/2016/5/9/chartex" xmlns:cx4="http://schemas.microsoft.com/office/drawing/2016/5/10/chartex" xmlns:cx5="http://schemas.microsoft.com/office/drawing/2016/5/11/chartex" xmlns:cx6="http://schemas.microsoft.com/office/drawing/2016/5/12/chartex" xmlns:cx7="http://schemas.microsoft.com/office/drawing/2016/5/13/chartex" xmlns:cx8="http://schemas.microsoft.com/office/drawing/2016/5/14/chartex" xmlns:mc="http://schemas.openxmlformats.org/markup-compatibility/2006" xmlns:aink="http://schemas.microsoft.com/office/drawing/2016/ink" xmlns:am3d="http://schemas.microsoft.com/office/drawing/2017/model3d" xmlns:o="urn:schemas-microsoft-com:office:office" xmlns:oel="http://schemas.microsoft.com/office/2019/extlst" xmlns:r="http://schemas.openxmlformats.org/officeDocument/2006/relationships" xmlns:m="http://schemas.openxmlformats.org/officeDocument/2006/math" xmlns:v="urn:schemas-microsoft-com:vml" xmlns:wp14="http://schemas.microsoft.com/office/word/2010/wordprocessingDrawing" xmlns:wp="http://schemas.openxmlformats.org/drawingml/2006/wordprocessingDrawing" xmlns:w10="urn:schemas-microsoft-com:office:word" xmlns:w="http://schemas.openxmlformats.org/wordprocessingml/2006/main" xmlns:w14="http://schemas.microsoft.com/office/word/2010/wordml" xmlns:w15="http://schemas.microsoft.com/office/word/2012/wordml" xmlns:w16cex="http://schemas.microsoft.com/office/word/2018/wordml/cex" xmlns:w16cid="http://schemas.microsoft.com/office/word/2016/wordml/cid" xmlns:w16="http://schemas.microsoft.com/office/word/2018/wordml" xmlns:w16du="http://schemas.microsoft.com/office/word/2023/wordml/word16du" xmlns:w16sdtdh="http://schemas.microsoft.com/office/word/2020/wordml/sdtdatahash" xmlns:w16sdtfl="http://schemas.microsoft.com/office/word/2024/wordml/sdtformatlock" xmlns:w16se="http://schemas.microsoft.com/office/word/2015/wordml/symex" xmlns:wpg="http://schemas.microsoft.com/office/word/2010/wordprocessingGroup" xmlns:wpi="http://schemas.microsoft.com/office/word/2010/wordprocessingInk" xmlns:wne="http://schemas.microsoft.com/office/word/2006/wordml" xmlns:wps="http://schemas.microsoft.com/office/word/2010/wordprocessingShape" mc:Ignorable="w14 w15 w16se w16cid w16 w16cex w16sdtdh w16sdtfl w16du wp14">
   <w:body>
     <w:p>
+      <w:pPr>
+        <w:jc w:val="center"/>
+        <w:rPr>
+          <w:b/>
+          <w:bCs/>
+          <w:sz w:val="52"/>
+          <w:szCs w:val="52"/>
+        </w:rPr>
+      </w:pPr>
       <w:r>
+        <w:rPr>
+          <w:b/>
+          <w:bCs/>
+          <w:sz w:val="52"/>
+          <w:szCs w:val="52"/>
+        </w:rPr>
         <w:t>Preset List</w:t>
       </w:r>
     </w:p>
-    <w:p/>
+    <w:p>
+      <w:pPr>
+        <w:spacing w:after="0" w:line="240" w:lineRule="auto"/>
+        <w:jc w:val="center"/>
+        <w:rPr>
+          <w:b/>
+          <w:bCs/>
+          <w:sz w:val="16"/>
+          <w:szCs w:val="16"/>
+        </w:rPr>
+      </w:pPr>
+      <w:r>
+        <w:rPr>
+          <w:b/>
+          <w:bCs/>
+          <w:sz w:val="16"/>
+          <w:szCs w:val="16"/>
+        </w:rPr>
+        <w:t xml:space="preserve">Rev. 0 – 2025/10/15 – </w:t>
+      </w:r>
+      <w:r>
+        <w:rPr>
+          <w:b/>
+          <w:bCs/>
+          <w:sz w:val="16"/>
+          <w:szCs w:val="16"/>
+        </w:rPr>
+        <w:t>Placeholder / Pending</w:t>
+      </w:r>
+    </w:p>
+    <w:p>
+      <w:pPr>
+        <w:spacing w:after="0" w:line="240" w:lineRule="auto"/>
+        <w:jc w:val="center"/>
+        <w:rPr>
+          <w:b/>
+          <w:bCs/>
+          <w:sz w:val="16"/>
+          <w:szCs w:val="16"/>
+        </w:rPr>
+      </w:pPr>
+    </w:p>
+    <w:p>
+      <w:pPr>
+        <w:spacing w:after="0" w:line="240" w:lineRule="auto"/>
+        <w:rPr>
+          <w:b/>
+          <w:bCs/>
+        </w:rPr>
+      </w:pPr>
+    </w:p>
+    <w:tbl>
+      <w:tblPr>
+        <w:tblStyle w:val="TableGrid"/>
+        <w:tblW w:w="0" w:type="auto"/>
+        <w:tblLook w:val="04A0" w:firstRow="1" w:lastRow="0" w:firstColumn="1" w:lastColumn="0" w:noHBand="0" w:noVBand="1"/>
+      </w:tblPr>
+      <w:tblGrid>
+        <w:gridCol w:w="1255"/>
+        <w:gridCol w:w="3419"/>
+        <w:gridCol w:w="1171"/>
+        <w:gridCol w:w="3505"/>
+      </w:tblGrid>
+      <w:tr>
+        <w:tc>
+          <w:tcPr>
+            <w:tcW w:w="4674" w:type="dxa"/>
+            <w:gridSpan w:val="2"/>
+          </w:tcPr>
+          <w:p>
+            <w:pPr>
+              <w:jc w:val="center"/>
+            </w:pPr>
+            <w:r>
+              <w:rPr>
+                <w:sz w:val="32"/>
+                <w:szCs w:val="32"/>
+              </w:rPr>
+              <w:t>Camera 3</w:t>
+            </w:r>
+          </w:p>
+        </w:tc>
+        <w:tc>
+          <w:tcPr>
+            <w:tcW w:w="4676" w:type="dxa"/>
+            <w:gridSpan w:val="2"/>
+          </w:tcPr>
+          <w:p>
+            <w:pPr>
+              <w:jc w:val="center"/>
+            </w:pPr>
+            <w:r>
+              <w:rPr>
+                <w:sz w:val="32"/>
+                <w:szCs w:val="32"/>
+              </w:rPr>
+              <w:t xml:space="preserve">Camera </w:t>
+            </w:r>
+            <w:r>
+              <w:rPr>
+                <w:sz w:val="32"/>
+                <w:szCs w:val="32"/>
+              </w:rPr>
+              <w:t>4</w:t>
+            </w:r>
+          </w:p>
+        </w:tc>
+      </w:tr>
+      <w:tr>
+        <w:trPr>
+          <w:trHeight w:val="432"/>
+        </w:trPr>
+        <w:tc>
+          <w:tcPr>
+            <w:tcW w:w="1255" w:type="dxa"/>
+          </w:tcPr>
+          <w:p>
+            <w:pPr>
+              <w:jc w:val="center"/>
+            </w:pPr>
+            <w:r>
+              <w:t xml:space="preserve">Preset </w:t>
+            </w:r>
+            <w:r>
+              <w:t>#</w:t>
+            </w:r>
+          </w:p>
+        </w:tc>
+        <w:tc>
+          <w:tcPr>
+            <w:tcW w:w="3419" w:type="dxa"/>
+          </w:tcPr>
+          <w:p/>
+        </w:tc>
+        <w:tc>
+          <w:tcPr>
+            <w:tcW w:w="1171" w:type="dxa"/>
+          </w:tcPr>
+          <w:p>
+            <w:pPr>
+              <w:jc w:val="center"/>
+            </w:pPr>
+            <w:r>
+              <w:t>Preset #</w:t>
+            </w:r>
+          </w:p>
+        </w:tc>
+        <w:tc>
+          <w:tcPr>
+            <w:tcW w:w="3505" w:type="dxa"/>
+          </w:tcPr>
+          <w:p/>
+        </w:tc>
+      </w:tr>
+      <w:tr>
+        <w:trPr>
+          <w:trHeight w:val="432"/>
+        </w:trPr>
+        <w:tc>
+          <w:tcPr>
+            <w:tcW w:w="1255" w:type="dxa"/>
+          </w:tcPr>
+          <w:p>
+            <w:pPr>
+              <w:jc w:val="center"/>
+            </w:pPr>
+            <w:r>
+              <w:t>1</w:t>
+            </w:r>
+          </w:p>
+        </w:tc>
+        <w:tc>
+          <w:tcPr>
+            <w:tcW w:w="3419" w:type="dxa"/>
+          </w:tcPr>
+          <w:p/>
+        </w:tc>
+        <w:tc>
+          <w:tcPr>
+            <w:tcW w:w="1171" w:type="dxa"/>
+          </w:tcPr>
+          <w:p>
+            <w:pPr>
+              <w:jc w:val="center"/>
+            </w:pPr>
+            <w:r>
+              <w:t>1</w:t>
+            </w:r>
+          </w:p>
+        </w:tc>
+        <w:tc>
+          <w:tcPr>
+            <w:tcW w:w="3505" w:type="dxa"/>
+          </w:tcPr>
+          <w:p/>
+        </w:tc>
+      </w:tr>
+      <w:tr>
+        <w:trPr>
+          <w:trHeight w:val="432"/>
+        </w:trPr>
+        <w:tc>
+          <w:tcPr>
+            <w:tcW w:w="1255" w:type="dxa"/>
+          </w:tcPr>
+          <w:p>
+            <w:pPr>
+              <w:jc w:val="center"/>
+            </w:pPr>
+            <w:r>
+              <w:t>2</w:t>
+            </w:r>
+          </w:p>
+        </w:tc>
+        <w:tc>
+          <w:tcPr>
+            <w:tcW w:w="3419" w:type="dxa"/>
+          </w:tcPr>
+          <w:p/>
+        </w:tc>
+        <w:tc>
+          <w:tcPr>
+            <w:tcW w:w="1171" w:type="dxa"/>
+          </w:tcPr>
+          <w:p>
+            <w:pPr>
+              <w:jc w:val="center"/>
+            </w:pPr>
+            <w:r>
+              <w:t>2</w:t>
+            </w:r>
+          </w:p>
+        </w:tc>
+        <w:tc>
+          <w:tcPr>
+            <w:tcW w:w="3505" w:type="dxa"/>
+          </w:tcPr>
+          <w:p/>
+        </w:tc>
+      </w:tr>
+      <w:tr>
+        <w:trPr>
+          <w:trHeight w:val="432"/>
+        </w:trPr>
+        <w:tc>
+          <w:tcPr>
+            <w:tcW w:w="1255" w:type="dxa"/>
+          </w:tcPr>
+          <w:p>
+            <w:pPr>
+              <w:jc w:val="center"/>
+            </w:pPr>
+            <w:r>
+              <w:t>3</w:t>
+            </w:r>
+          </w:p>
+        </w:tc>
+        <w:tc>
+          <w:tcPr>
+            <w:tcW w:w="3419" w:type="dxa"/>
+          </w:tcPr>
+          <w:p/>
+        </w:tc>
+        <w:tc>
+          <w:tcPr>
+            <w:tcW w:w="1171" w:type="dxa"/>
+          </w:tcPr>
+          <w:p>
+            <w:pPr>
+              <w:jc w:val="center"/>
+            </w:pPr>
+            <w:r>
+              <w:t>3</w:t>
+            </w:r>
+          </w:p>
+        </w:tc>
+        <w:tc>
+          <w:tcPr>
+            <w:tcW w:w="3505" w:type="dxa"/>
+          </w:tcPr>
+          <w:p/>
+        </w:tc>
+      </w:tr>
+      <w:tr>
+        <w:trPr>
+          <w:trHeight w:val="432"/>
+        </w:trPr>
+        <w:tc>
+          <w:tcPr>
+            <w:tcW w:w="1255" w:type="dxa"/>
+          </w:tcPr>
+          <w:p>
+            <w:pPr>
+              <w:jc w:val="center"/>
+            </w:pPr>
+            <w:r>
+              <w:t>4</w:t>
+            </w:r>
+          </w:p>
+        </w:tc>
+        <w:tc>
+          <w:tcPr>
+            <w:tcW w:w="3419" w:type="dxa"/>
+          </w:tcPr>
+          <w:p/>
+        </w:tc>
+        <w:tc>
+          <w:tcPr>
+            <w:tcW w:w="1171" w:type="dxa"/>
+          </w:tcPr>
+          <w:p>
+            <w:pPr>
+              <w:jc w:val="center"/>
+            </w:pPr>
+            <w:r>
+              <w:t>4</w:t>
+            </w:r>
+          </w:p>
+        </w:tc>
+        <w:tc>
+          <w:tcPr>
+            <w:tcW w:w="3505" w:type="dxa"/>
+          </w:tcPr>
+          <w:p/>
+        </w:tc>
+      </w:tr>
+      <w:tr>
+        <w:trPr>
+          <w:trHeight w:val="432"/>
+        </w:trPr>
+        <w:tc>
+          <w:tcPr>
+            <w:tcW w:w="1255" w:type="dxa"/>
+          </w:tcPr>
+          <w:p>
+            <w:pPr>
+              <w:jc w:val="center"/>
+            </w:pPr>
+            <w:r>
+              <w:t>5</w:t>
+            </w:r>
+          </w:p>
+        </w:tc>
+        <w:tc>
+          <w:tcPr>
+            <w:tcW w:w="3419" w:type="dxa"/>
+          </w:tcPr>
+          <w:p/>
+        </w:tc>
+        <w:tc>
+          <w:tcPr>
+            <w:tcW w:w="1171" w:type="dxa"/>
+          </w:tcPr>
+          <w:p>
+            <w:pPr>
+              <w:jc w:val="center"/>
+            </w:pPr>
+            <w:r>
+              <w:t>5</w:t>
+            </w:r>
+          </w:p>
+        </w:tc>
+        <w:tc>
+          <w:tcPr>
+            <w:tcW w:w="3505" w:type="dxa"/>
+          </w:tcPr>
+          <w:p/>
+        </w:tc>
+      </w:tr>
+      <w:tr>
+        <w:trPr>
+          <w:trHeight w:val="432"/>
+        </w:trPr>
+        <w:tc>
+          <w:tcPr>
+            <w:tcW w:w="1255" w:type="dxa"/>
+          </w:tcPr>
+          <w:p>
+            <w:pPr>
+              <w:jc w:val="center"/>
+            </w:pPr>
+            <w:r>
+              <w:t>6</w:t>
+            </w:r>
+          </w:p>
+        </w:tc>
+        <w:tc>
+          <w:tcPr>
+            <w:tcW w:w="3419" w:type="dxa"/>
+          </w:tcPr>
+          <w:p/>
+        </w:tc>
+        <w:tc>
+          <w:tcPr>
+            <w:tcW w:w="1171" w:type="dxa"/>
+          </w:tcPr>
+          <w:p>
+            <w:pPr>
+              <w:jc w:val="center"/>
+            </w:pPr>
+            <w:r>
+              <w:t>6</w:t>
+            </w:r>
+          </w:p>
+        </w:tc>
+        <w:tc>
+          <w:tcPr>
+            <w:tcW w:w="3505" w:type="dxa"/>
+          </w:tcPr>
+          <w:p/>
+        </w:tc>
+      </w:tr>
+      <w:tr>
+        <w:trPr>
+          <w:trHeight w:val="432"/>
+        </w:trPr>
+        <w:tc>
+          <w:tcPr>
+            <w:tcW w:w="1255" w:type="dxa"/>
+          </w:tcPr>
+          <w:p>
+            <w:pPr>
+              <w:jc w:val="center"/>
+            </w:pPr>
+            <w:r>
+              <w:t>7</w:t>
+            </w:r>
+          </w:p>
+        </w:tc>
+        <w:tc>
+          <w:tcPr>
+            <w:tcW w:w="3419" w:type="dxa"/>
+          </w:tcPr>
+          <w:p/>
+        </w:tc>
+        <w:tc>
+          <w:tcPr>
+            <w:tcW w:w="1171" w:type="dxa"/>
+          </w:tcPr>
+          <w:p>
+            <w:pPr>
+              <w:jc w:val="center"/>
+            </w:pPr>
+            <w:r>
+              <w:t>7</w:t>
+            </w:r>
+          </w:p>
+        </w:tc>
+        <w:tc>
+          <w:tcPr>
+            <w:tcW w:w="3505" w:type="dxa"/>
+          </w:tcPr>
+          <w:p/>
+        </w:tc>
+      </w:tr>
+      <w:tr>
+        <w:trPr>
+          <w:trHeight w:val="432"/>
+        </w:trPr>
+        <w:tc>
+          <w:tcPr>
+            <w:tcW w:w="1255" w:type="dxa"/>
+          </w:tcPr>
+          <w:p>
+            <w:pPr>
+              <w:jc w:val="center"/>
+            </w:pPr>
+            <w:r>
+              <w:t>8</w:t>
+            </w:r>
+          </w:p>
+        </w:tc>
+        <w:tc>
+          <w:tcPr>
+            <w:tcW w:w="3419" w:type="dxa"/>
+          </w:tcPr>
+          <w:p/>
+        </w:tc>
+        <w:tc>
+          <w:tcPr>
+            <w:tcW w:w="1171" w:type="dxa"/>
+          </w:tcPr>
+          <w:p>
+            <w:pPr>
+              <w:jc w:val="center"/>
+            </w:pPr>
+            <w:r>
+              <w:t>8</w:t>
+            </w:r>
+          </w:p>
+        </w:tc>
+        <w:tc>
+          <w:tcPr>
+            <w:tcW w:w="3505" w:type="dxa"/>
+          </w:tcPr>
+          <w:p/>
+        </w:tc>
+      </w:tr>
+      <w:tr>
+        <w:trPr>
+          <w:trHeight w:val="432"/>
+        </w:trPr>
+        <w:tc>
+          <w:tcPr>
+            <w:tcW w:w="1255" w:type="dxa"/>
+          </w:tcPr>
+          <w:p>
+            <w:pPr>
+              <w:jc w:val="center"/>
+            </w:pPr>
+            <w:r>
+              <w:t>9</w:t>
+            </w:r>
+          </w:p>
+        </w:tc>
+        <w:tc>
+          <w:tcPr>
+            <w:tcW w:w="3419" w:type="dxa"/>
+          </w:tcPr>
+          <w:p/>
+        </w:tc>
+        <w:tc>
+          <w:tcPr>
+            <w:tcW w:w="1171" w:type="dxa"/>
+          </w:tcPr>
+          <w:p>
+            <w:pPr>
+              <w:jc w:val="center"/>
+            </w:pPr>
+            <w:r>
+              <w:t>9</w:t>
+            </w:r>
+          </w:p>
+        </w:tc>
+        <w:tc>
+          <w:tcPr>
+            <w:tcW w:w="3505" w:type="dxa"/>
+          </w:tcPr>
+          <w:p/>
+        </w:tc>
+      </w:tr>
+      <w:tr>
+        <w:trPr>
+          <w:trHeight w:val="432"/>
+        </w:trPr>
+        <w:tc>
+          <w:tcPr>
+            <w:tcW w:w="1255" w:type="dxa"/>
+          </w:tcPr>
+          <w:p>
+            <w:pPr>
+              <w:jc w:val="center"/>
+            </w:pPr>
+            <w:r>
+              <w:t>10</w:t>
+            </w:r>
+          </w:p>
+        </w:tc>
+        <w:tc>
+          <w:tcPr>
+            <w:tcW w:w="3419" w:type="dxa"/>
+          </w:tcPr>
+          <w:p/>
+        </w:tc>
+        <w:tc>
+          <w:tcPr>
+            <w:tcW w:w="1171" w:type="dxa"/>
+          </w:tcPr>
+          <w:p>
+            <w:pPr>
+              <w:jc w:val="center"/>
+            </w:pPr>
+            <w:r>
+              <w:t>10</w:t>
+            </w:r>
+          </w:p>
+        </w:tc>
+        <w:tc>
+          <w:tcPr>
+            <w:tcW w:w="3505" w:type="dxa"/>
+          </w:tcPr>
+          <w:p/>
+        </w:tc>
+      </w:tr>
+    </w:tbl>
+    <w:p>
+      <w:pPr>
+        <w:spacing w:after="0" w:line="240" w:lineRule="auto"/>
+      </w:pPr>
+    </w:p>
+    <w:p>
+      <w:pPr>
+        <w:spacing w:after="0" w:line="240" w:lineRule="auto"/>
+      </w:pPr>
+    </w:p>
+    <w:p>
+      <w:pPr>
+        <w:spacing w:after="0" w:line="240" w:lineRule="auto"/>
+      </w:pPr>
+    </w:p>
+    <w:p>
+      <w:pPr>
+        <w:spacing w:after="0" w:line="240" w:lineRule="auto"/>
+      </w:pPr>
+    </w:p>
     <w:sectPr>
       <w:pgSz w:w="12240" w:h="15840"/>
       <w:pgMar w:top="1440" w:right="1440" w:bottom="1440" w:left="1440" w:header="720" w:footer="720" w:gutter="0"/>
@@ -418,7 +1037,7 @@
   <w:style w:type="paragraph" w:default="1" w:styleId="Normal">
     <w:name w:val="Normal"/>
     <w:qFormat/>
-    <w:rsid w:val="00353C72"/>
+    <w:rsid w:val="004620DC"/>
   </w:style>
   <w:style w:type="paragraph" w:styleId="Heading1">
     <w:name w:val="heading 1"/>
@@ -935,6 +1554,25 @@
       <w:color w:val="0F4761" w:themeColor="accent1" w:themeShade="BF"/>
       <w:spacing w:val="5"/>
     </w:rPr>
+  </w:style>
+  <w:style w:type="table" w:styleId="TableGrid">
+    <w:name w:val="Table Grid"/>
+    <w:basedOn w:val="TableNormal"/>
+    <w:uiPriority w:val="39"/>
+    <w:rsid w:val="004620DC"/>
+    <w:pPr>
+      <w:spacing w:after="0" w:line="240" w:lineRule="auto"/>
+    </w:pPr>
+    <w:tblPr>
+      <w:tblBorders>
+        <w:top w:val="single" w:sz="4" w:space="0" w:color="auto"/>
+        <w:left w:val="single" w:sz="4" w:space="0" w:color="auto"/>
+        <w:bottom w:val="single" w:sz="4" w:space="0" w:color="auto"/>
+        <w:right w:val="single" w:sz="4" w:space="0" w:color="auto"/>
+        <w:insideH w:val="single" w:sz="4" w:space="0" w:color="auto"/>
+        <w:insideV w:val="single" w:sz="4" w:space="0" w:color="auto"/>
+      </w:tblBorders>
+    </w:tblPr>
   </w:style>
 </w:styles>
 </file>

</xml_diff>